<commit_message>
docs(rental): update master specification docx with 6-table architecture and live production audit report
</commit_message>
<xml_diff>
--- a/Rental Final Table/LetzRyd_Rental_System_Master_Specification.docx
+++ b/Rental Final Table/LetzRyd_Rental_System_Master_Specification.docx
@@ -523,12 +523,12 @@
         <w:rPr>
           <w:color w:val="1F4E79"/>
         </w:rPr>
-        <w:t>2. The 5-Table Database Architecture</w:t>
+        <w:t>2. The 6-Table Database Architecture</w:t>
       </w:r>
     </w:p>
     <w:p>
       <w:r>
-        <w:t>To eliminate spreadsheet confusion, the entire rental system is structured into 5 clean database tables. Here is the exact purpose, schema, and function of each table in plain English:</w:t>
+        <w:t>To eliminate spreadsheet confusion, the entire rental system is structured into 6 clean database tables. Here is the exact purpose, schema, and function of each table in plain English:</w:t>
       </w:r>
     </w:p>
     <w:p>
@@ -2603,7 +2603,7 @@
         <w:rPr>
           <w:color w:val="1F4E79"/>
         </w:rPr>
-        <w:t>Table 4: daily_rent_log (The Daily Attendance &amp; Rent Diary)</w:t>
+        <w:t>Table 4: core_daily_vehicle_status (The Daily Attendance Register)</w:t>
       </w:r>
     </w:p>
     <w:p>
@@ -2611,7 +2611,7 @@
         <w:rPr>
           <w:i/>
         </w:rPr>
-        <w:t>Generates 1 row per car per day. Records daily attendance and calculates net daily rent. Weekly Hisaab is simply the sum of these 7 daily records.</w:t>
+        <w:t>The single source of truth for daily vehicle attendance. Tracks whether each car was Active, In Yard, or in Maintenance. Directly provides the billable_rent_day boolean.</w:t>
       </w:r>
     </w:p>
     <w:tbl>
@@ -2731,7 +2731,7 @@
                 <w:color w:val="282828"/>
                 <w:sz w:val="18"/>
               </w:rPr>
-              <w:t>log_date</w:t>
+              <w:t>status_date</w:t>
             </w:r>
           </w:p>
         </w:tc>
@@ -2775,7 +2775,7 @@
                 <w:color w:val="282828"/>
                 <w:sz w:val="18"/>
               </w:rPr>
-              <w:t>Specific calendar day (e.g. '2026-06-29')</w:t>
+              <w:t>Calendar date of attendance</w:t>
             </w:r>
           </w:p>
         </w:tc>
@@ -2873,7 +2873,7 @@
                 <w:color w:val="282828"/>
                 <w:sz w:val="18"/>
               </w:rPr>
-              <w:t>vehicle_status</w:t>
+              <w:t>final_status</w:t>
             </w:r>
           </w:p>
         </w:tc>
@@ -2895,7 +2895,7 @@
                 <w:color w:val="282828"/>
                 <w:sz w:val="18"/>
               </w:rPr>
-              <w:t>VARCHAR(32)</w:t>
+              <w:t>VARCHAR(64)</w:t>
             </w:r>
           </w:p>
         </w:tc>
@@ -2917,7 +2917,7 @@
                 <w:color w:val="282828"/>
                 <w:sz w:val="18"/>
               </w:rPr>
-              <w:t>'On Road' or 'Maintenance' / 'Breakdown'</w:t>
+              <w:t>Operational status ('Active', 'Maintenance', 'RFD', 'In Yard', 'Drop Off')</w:t>
             </w:r>
           </w:p>
         </w:tc>
@@ -2944,7 +2944,7 @@
                 <w:color w:val="282828"/>
                 <w:sz w:val="18"/>
               </w:rPr>
-              <w:t>is_billable</w:t>
+              <w:t>billable_rent_day</w:t>
             </w:r>
           </w:p>
         </w:tc>
@@ -2988,7 +2988,7 @@
                 <w:color w:val="282828"/>
                 <w:sz w:val="18"/>
               </w:rPr>
-              <w:t>TRUE if On Road, FALSE if in workshop/maintenance</w:t>
+              <w:t>Master truth flag: TRUE = billable, FALSE = non-billable</w:t>
             </w:r>
           </w:p>
         </w:tc>
@@ -3015,7 +3015,7 @@
                 <w:color w:val="282828"/>
                 <w:sz w:val="18"/>
               </w:rPr>
-              <w:t>daily_rent_applied</w:t>
+              <w:t>car_model</w:t>
             </w:r>
           </w:p>
         </w:tc>
@@ -3037,7 +3037,7 @@
                 <w:color w:val="282828"/>
                 <w:sz w:val="18"/>
               </w:rPr>
-              <w:t>NUMERIC(10,2)</w:t>
+              <w:t>VARCHAR(64)</w:t>
             </w:r>
           </w:p>
         </w:tc>
@@ -3059,7 +3059,7 @@
                 <w:color w:val="282828"/>
                 <w:sz w:val="18"/>
               </w:rPr>
-              <w:t>Calculated base rent for that day (₹0 if not billable)</w:t>
+              <w:t>Model of the vehicle on that date</w:t>
             </w:r>
           </w:p>
         </w:tc>
@@ -3086,7 +3086,7 @@
                 <w:color w:val="282828"/>
                 <w:sz w:val="18"/>
               </w:rPr>
-              <w:t>daily_indemnity_applied</w:t>
+              <w:t>partner_id</w:t>
             </w:r>
           </w:p>
         </w:tc>
@@ -3108,7 +3108,7 @@
                 <w:color w:val="282828"/>
                 <w:sz w:val="18"/>
               </w:rPr>
-              <w:t>NUMERIC(10,2)</w:t>
+              <w:t>VARCHAR(64)</w:t>
             </w:r>
           </w:p>
         </w:tc>
@@ -3130,78 +3130,7 @@
                 <w:color w:val="282828"/>
                 <w:sz w:val="18"/>
               </w:rPr>
-              <w:t>Calculated insurance for that day (₹0 if not billable)</w:t>
-            </w:r>
-          </w:p>
-        </w:tc>
-      </w:tr>
-      <w:tr>
-        <w:trPr>
-          <w:cantSplit/>
-        </w:trPr>
-        <w:tc>
-          <w:tcPr>
-            <w:tcW w:type="dxa" w:w="3312"/>
-            <w:shd w:val="clear" w:color="auto" w:fill="F2F4F8"/>
-            <w:tcMar>
-              <w:top w:w="100" w:type="dxa"/>
-              <w:bottom w:w="100" w:type="dxa"/>
-              <w:left w:w="160" w:type="dxa"/>
-              <w:right w:w="160" w:type="dxa"/>
-            </w:tcMar>
-          </w:tcPr>
-          <w:p>
-            <w:r>
-              <w:rPr>
-                <w:rFonts w:ascii="Calibri" w:hAnsi="Calibri"/>
-                <w:color w:val="282828"/>
-                <w:sz w:val="18"/>
-              </w:rPr>
-              <w:t>net_daily_rent</w:t>
-            </w:r>
-          </w:p>
-        </w:tc>
-        <w:tc>
-          <w:tcPr>
-            <w:tcW w:type="dxa" w:w="3312"/>
-            <w:shd w:val="clear" w:color="auto" w:fill="F2F4F8"/>
-            <w:tcMar>
-              <w:top w:w="100" w:type="dxa"/>
-              <w:bottom w:w="100" w:type="dxa"/>
-              <w:left w:w="160" w:type="dxa"/>
-              <w:right w:w="160" w:type="dxa"/>
-            </w:tcMar>
-          </w:tcPr>
-          <w:p>
-            <w:r>
-              <w:rPr>
-                <w:rFonts w:ascii="Calibri" w:hAnsi="Calibri"/>
-                <w:color w:val="282828"/>
-                <w:sz w:val="18"/>
-              </w:rPr>
-              <w:t>NUMERIC(10,2)</w:t>
-            </w:r>
-          </w:p>
-        </w:tc>
-        <w:tc>
-          <w:tcPr>
-            <w:tcW w:type="dxa" w:w="3312"/>
-            <w:shd w:val="clear" w:color="auto" w:fill="F2F4F8"/>
-            <w:tcMar>
-              <w:top w:w="100" w:type="dxa"/>
-              <w:bottom w:w="100" w:type="dxa"/>
-              <w:left w:w="160" w:type="dxa"/>
-              <w:right w:w="160" w:type="dxa"/>
-            </w:tcMar>
-          </w:tcPr>
-          <w:p>
-            <w:r>
-              <w:rPr>
-                <w:rFonts w:ascii="Calibri" w:hAnsi="Calibri"/>
-                <w:color w:val="282828"/>
-                <w:sz w:val="18"/>
-              </w:rPr>
-              <w:t>Total = daily_rent_applied + daily_indemnity_applied</w:t>
+              <w:t>Driver or operator assigned to vehicle</w:t>
             </w:r>
           </w:p>
         </w:tc>
@@ -3220,7 +3149,7 @@
         <w:rPr>
           <w:color w:val="1F4E79"/>
         </w:rPr>
-        <w:t>Table 5: core_rent_logs (The Audit Memory &amp; History)</w:t>
+        <w:t>Table 5: daily_rent_log (The Daily Financial Ledger / Bill)</w:t>
       </w:r>
     </w:p>
     <w:p>
@@ -3228,7 +3157,7 @@
         <w:rPr>
           <w:i/>
         </w:rPr>
-        <w:t>Every time an Ops manager edits a driver's rent or swaps plans, this table logs the change. Prevents historical Hisaabs from changing retroactively.</w:t>
+        <w:t>The final billing ledger. Generates 1 row per car per day. Records daily attendance, trips completed, rent applied, indemnity applied, and net daily rent. Weekly Hisaab is the sum of these 7 daily records.</w:t>
       </w:r>
     </w:p>
     <w:tbl>
@@ -3348,7 +3277,7 @@
                 <w:color w:val="282828"/>
                 <w:sz w:val="18"/>
               </w:rPr>
-              <w:t>log_id</w:t>
+              <w:t>log_date</w:t>
             </w:r>
           </w:p>
         </w:tc>
@@ -3370,7 +3299,7 @@
                 <w:color w:val="282828"/>
                 <w:sz w:val="18"/>
               </w:rPr>
-              <w:t>SERIAL</w:t>
+              <w:t>DATE</w:t>
             </w:r>
           </w:p>
         </w:tc>
@@ -3392,7 +3321,7 @@
                 <w:color w:val="282828"/>
                 <w:sz w:val="18"/>
               </w:rPr>
-              <w:t>Unique log event ID</w:t>
+              <w:t>Specific calendar day being billed (e.g. '2026-06-29')</w:t>
             </w:r>
           </w:p>
         </w:tc>
@@ -3419,7 +3348,7 @@
                 <w:color w:val="282828"/>
                 <w:sz w:val="18"/>
               </w:rPr>
-              <w:t>vehicle_number</w:t>
+              <w:t>week_id</w:t>
             </w:r>
           </w:p>
         </w:tc>
@@ -3441,7 +3370,7 @@
                 <w:color w:val="282828"/>
                 <w:sz w:val="18"/>
               </w:rPr>
-              <w:t>VARCHAR(32)</w:t>
+              <w:t>VARCHAR(16)</w:t>
             </w:r>
           </w:p>
         </w:tc>
@@ -3463,7 +3392,7 @@
                 <w:color w:val="282828"/>
                 <w:sz w:val="18"/>
               </w:rPr>
-              <w:t>Vehicle registration number</w:t>
+              <w:t>Billing week code (e.g. 'CY26WK26')</w:t>
             </w:r>
           </w:p>
         </w:tc>
@@ -3490,7 +3419,7 @@
                 <w:color w:val="282828"/>
                 <w:sz w:val="18"/>
               </w:rPr>
-              <w:t>old_plan_name</w:t>
+              <w:t>vehicle_number</w:t>
             </w:r>
           </w:p>
         </w:tc>
@@ -3512,7 +3441,7 @@
                 <w:color w:val="282828"/>
                 <w:sz w:val="18"/>
               </w:rPr>
-              <w:t>VARCHAR(64)</w:t>
+              <w:t>VARCHAR(32)</w:t>
             </w:r>
           </w:p>
         </w:tc>
@@ -3534,7 +3463,7 @@
                 <w:color w:val="282828"/>
                 <w:sz w:val="18"/>
               </w:rPr>
-              <w:t>Previous plan name</w:t>
+              <w:t>Vehicle registration number</w:t>
             </w:r>
           </w:p>
         </w:tc>
@@ -3561,7 +3490,7 @@
                 <w:color w:val="282828"/>
                 <w:sz w:val="18"/>
               </w:rPr>
-              <w:t>new_plan_name</w:t>
+              <w:t>partner_id</w:t>
             </w:r>
           </w:p>
         </w:tc>
@@ -3605,7 +3534,7 @@
                 <w:color w:val="282828"/>
                 <w:sz w:val="18"/>
               </w:rPr>
-              <w:t>New plan name</w:t>
+              <w:t>Driver or operator ID billed</w:t>
             </w:r>
           </w:p>
         </w:tc>
@@ -3632,7 +3561,7 @@
                 <w:color w:val="282828"/>
                 <w:sz w:val="18"/>
               </w:rPr>
-              <w:t>old_daily_rent</w:t>
+              <w:t>attendance_status</w:t>
             </w:r>
           </w:p>
         </w:tc>
@@ -3654,7 +3583,7 @@
                 <w:color w:val="282828"/>
                 <w:sz w:val="18"/>
               </w:rPr>
-              <w:t>NUMERIC(10,2)</w:t>
+              <w:t>VARCHAR(64)</w:t>
             </w:r>
           </w:p>
         </w:tc>
@@ -3676,7 +3605,7 @@
                 <w:color w:val="282828"/>
                 <w:sz w:val="18"/>
               </w:rPr>
-              <w:t>Previous rent before change</w:t>
+              <w:t>Attendance status ('Active', 'Maintenance', 'RFD')</w:t>
             </w:r>
           </w:p>
         </w:tc>
@@ -3703,7 +3632,7 @@
                 <w:color w:val="282828"/>
                 <w:sz w:val="18"/>
               </w:rPr>
-              <w:t>new_daily_rent</w:t>
+              <w:t>is_billable_day</w:t>
             </w:r>
           </w:p>
         </w:tc>
@@ -3725,7 +3654,7 @@
                 <w:color w:val="282828"/>
                 <w:sz w:val="18"/>
               </w:rPr>
-              <w:t>NUMERIC(10,2)</w:t>
+              <w:t>BOOLEAN</w:t>
             </w:r>
           </w:p>
         </w:tc>
@@ -3747,7 +3676,7 @@
                 <w:color w:val="282828"/>
                 <w:sz w:val="18"/>
               </w:rPr>
-              <w:t>New rent after change</w:t>
+              <w:t>TRUE if On Road, FALSE if in workshop/maintenance</w:t>
             </w:r>
           </w:p>
         </w:tc>
@@ -3774,7 +3703,7 @@
                 <w:color w:val="282828"/>
                 <w:sz w:val="18"/>
               </w:rPr>
-              <w:t>changed_by</w:t>
+              <w:t>weekly_completed_trips</w:t>
             </w:r>
           </w:p>
         </w:tc>
@@ -3796,7 +3725,7 @@
                 <w:color w:val="282828"/>
                 <w:sz w:val="18"/>
               </w:rPr>
-              <w:t>VARCHAR(64)</w:t>
+              <w:t>NUMERIC(10,2)</w:t>
             </w:r>
           </w:p>
         </w:tc>
@@ -3818,7 +3747,908 @@
                 <w:color w:val="282828"/>
                 <w:sz w:val="18"/>
               </w:rPr>
-              <w:t>Ops manager or system process who made the change</w:t>
+              <w:t>Completed Uber trips for the billing week</w:t>
+            </w:r>
+          </w:p>
+        </w:tc>
+      </w:tr>
+      <w:tr>
+        <w:trPr>
+          <w:cantSplit/>
+        </w:trPr>
+        <w:tc>
+          <w:tcPr>
+            <w:tcW w:type="dxa" w:w="3312"/>
+            <w:shd w:val="clear" w:color="auto" w:fill="FFFFFF"/>
+            <w:tcMar>
+              <w:top w:w="100" w:type="dxa"/>
+              <w:bottom w:w="100" w:type="dxa"/>
+              <w:left w:w="160" w:type="dxa"/>
+              <w:right w:w="160" w:type="dxa"/>
+            </w:tcMar>
+          </w:tcPr>
+          <w:p>
+            <w:r>
+              <w:rPr>
+                <w:rFonts w:ascii="Calibri" w:hAnsi="Calibri"/>
+                <w:color w:val="282828"/>
+                <w:sz w:val="18"/>
+              </w:rPr>
+              <w:t>applied_daily_rent</w:t>
+            </w:r>
+          </w:p>
+        </w:tc>
+        <w:tc>
+          <w:tcPr>
+            <w:tcW w:type="dxa" w:w="3312"/>
+            <w:shd w:val="clear" w:color="auto" w:fill="FFFFFF"/>
+            <w:tcMar>
+              <w:top w:w="100" w:type="dxa"/>
+              <w:bottom w:w="100" w:type="dxa"/>
+              <w:left w:w="160" w:type="dxa"/>
+              <w:right w:w="160" w:type="dxa"/>
+            </w:tcMar>
+          </w:tcPr>
+          <w:p>
+            <w:r>
+              <w:rPr>
+                <w:rFonts w:ascii="Calibri" w:hAnsi="Calibri"/>
+                <w:color w:val="282828"/>
+                <w:sz w:val="18"/>
+              </w:rPr>
+              <w:t>NUMERIC(10,2)</w:t>
+            </w:r>
+          </w:p>
+        </w:tc>
+        <w:tc>
+          <w:tcPr>
+            <w:tcW w:type="dxa" w:w="3312"/>
+            <w:shd w:val="clear" w:color="auto" w:fill="FFFFFF"/>
+            <w:tcMar>
+              <w:top w:w="100" w:type="dxa"/>
+              <w:bottom w:w="100" w:type="dxa"/>
+              <w:left w:w="160" w:type="dxa"/>
+              <w:right w:w="160" w:type="dxa"/>
+            </w:tcMar>
+          </w:tcPr>
+          <w:p>
+            <w:r>
+              <w:rPr>
+                <w:rFonts w:ascii="Calibri" w:hAnsi="Calibri"/>
+                <w:color w:val="282828"/>
+                <w:sz w:val="18"/>
+              </w:rPr>
+              <w:t>Daily base rent charged for that day (₹0 if not billable)</w:t>
+            </w:r>
+          </w:p>
+        </w:tc>
+      </w:tr>
+      <w:tr>
+        <w:trPr>
+          <w:cantSplit/>
+        </w:trPr>
+        <w:tc>
+          <w:tcPr>
+            <w:tcW w:type="dxa" w:w="3312"/>
+            <w:shd w:val="clear" w:color="auto" w:fill="F2F4F8"/>
+            <w:tcMar>
+              <w:top w:w="100" w:type="dxa"/>
+              <w:bottom w:w="100" w:type="dxa"/>
+              <w:left w:w="160" w:type="dxa"/>
+              <w:right w:w="160" w:type="dxa"/>
+            </w:tcMar>
+          </w:tcPr>
+          <w:p>
+            <w:r>
+              <w:rPr>
+                <w:rFonts w:ascii="Calibri" w:hAnsi="Calibri"/>
+                <w:color w:val="282828"/>
+                <w:sz w:val="18"/>
+              </w:rPr>
+              <w:t>applied_daily_indemnity</w:t>
+            </w:r>
+          </w:p>
+        </w:tc>
+        <w:tc>
+          <w:tcPr>
+            <w:tcW w:type="dxa" w:w="3312"/>
+            <w:shd w:val="clear" w:color="auto" w:fill="F2F4F8"/>
+            <w:tcMar>
+              <w:top w:w="100" w:type="dxa"/>
+              <w:bottom w:w="100" w:type="dxa"/>
+              <w:left w:w="160" w:type="dxa"/>
+              <w:right w:w="160" w:type="dxa"/>
+            </w:tcMar>
+          </w:tcPr>
+          <w:p>
+            <w:r>
+              <w:rPr>
+                <w:rFonts w:ascii="Calibri" w:hAnsi="Calibri"/>
+                <w:color w:val="282828"/>
+                <w:sz w:val="18"/>
+              </w:rPr>
+              <w:t>NUMERIC(10,2)</w:t>
+            </w:r>
+          </w:p>
+        </w:tc>
+        <w:tc>
+          <w:tcPr>
+            <w:tcW w:type="dxa" w:w="3312"/>
+            <w:shd w:val="clear" w:color="auto" w:fill="F2F4F8"/>
+            <w:tcMar>
+              <w:top w:w="100" w:type="dxa"/>
+              <w:bottom w:w="100" w:type="dxa"/>
+              <w:left w:w="160" w:type="dxa"/>
+              <w:right w:w="160" w:type="dxa"/>
+            </w:tcMar>
+          </w:tcPr>
+          <w:p>
+            <w:r>
+              <w:rPr>
+                <w:rFonts w:ascii="Calibri" w:hAnsi="Calibri"/>
+                <w:color w:val="282828"/>
+                <w:sz w:val="18"/>
+              </w:rPr>
+              <w:t>Daily insurance/indemnity charged (₹0 if not billable)</w:t>
+            </w:r>
+          </w:p>
+        </w:tc>
+      </w:tr>
+      <w:tr>
+        <w:trPr>
+          <w:cantSplit/>
+        </w:trPr>
+        <w:tc>
+          <w:tcPr>
+            <w:tcW w:type="dxa" w:w="3312"/>
+            <w:shd w:val="clear" w:color="auto" w:fill="FFFFFF"/>
+            <w:tcMar>
+              <w:top w:w="100" w:type="dxa"/>
+              <w:bottom w:w="100" w:type="dxa"/>
+              <w:left w:w="160" w:type="dxa"/>
+              <w:right w:w="160" w:type="dxa"/>
+            </w:tcMar>
+          </w:tcPr>
+          <w:p>
+            <w:r>
+              <w:rPr>
+                <w:rFonts w:ascii="Calibri" w:hAnsi="Calibri"/>
+                <w:color w:val="282828"/>
+                <w:sz w:val="18"/>
+              </w:rPr>
+              <w:t>net_daily_rent</w:t>
+            </w:r>
+          </w:p>
+        </w:tc>
+        <w:tc>
+          <w:tcPr>
+            <w:tcW w:type="dxa" w:w="3312"/>
+            <w:shd w:val="clear" w:color="auto" w:fill="FFFFFF"/>
+            <w:tcMar>
+              <w:top w:w="100" w:type="dxa"/>
+              <w:bottom w:w="100" w:type="dxa"/>
+              <w:left w:w="160" w:type="dxa"/>
+              <w:right w:w="160" w:type="dxa"/>
+            </w:tcMar>
+          </w:tcPr>
+          <w:p>
+            <w:r>
+              <w:rPr>
+                <w:rFonts w:ascii="Calibri" w:hAnsi="Calibri"/>
+                <w:color w:val="282828"/>
+                <w:sz w:val="18"/>
+              </w:rPr>
+              <w:t>NUMERIC(10,2)</w:t>
+            </w:r>
+          </w:p>
+        </w:tc>
+        <w:tc>
+          <w:tcPr>
+            <w:tcW w:type="dxa" w:w="3312"/>
+            <w:shd w:val="clear" w:color="auto" w:fill="FFFFFF"/>
+            <w:tcMar>
+              <w:top w:w="100" w:type="dxa"/>
+              <w:bottom w:w="100" w:type="dxa"/>
+              <w:left w:w="160" w:type="dxa"/>
+              <w:right w:w="160" w:type="dxa"/>
+            </w:tcMar>
+          </w:tcPr>
+          <w:p>
+            <w:r>
+              <w:rPr>
+                <w:rFonts w:ascii="Calibri" w:hAnsi="Calibri"/>
+                <w:color w:val="282828"/>
+                <w:sz w:val="18"/>
+              </w:rPr>
+              <w:t>Total daily charge = applied_daily_rent + applied_daily_indemnity</w:t>
+            </w:r>
+          </w:p>
+        </w:tc>
+      </w:tr>
+      <w:tr>
+        <w:trPr>
+          <w:cantSplit/>
+        </w:trPr>
+        <w:tc>
+          <w:tcPr>
+            <w:tcW w:type="dxa" w:w="3312"/>
+            <w:shd w:val="clear" w:color="auto" w:fill="F2F4F8"/>
+            <w:tcMar>
+              <w:top w:w="100" w:type="dxa"/>
+              <w:bottom w:w="100" w:type="dxa"/>
+              <w:left w:w="160" w:type="dxa"/>
+              <w:right w:w="160" w:type="dxa"/>
+            </w:tcMar>
+          </w:tcPr>
+          <w:p>
+            <w:r>
+              <w:rPr>
+                <w:rFonts w:ascii="Calibri" w:hAnsi="Calibri"/>
+                <w:color w:val="282828"/>
+                <w:sz w:val="18"/>
+              </w:rPr>
+              <w:t>calculation_rule</w:t>
+            </w:r>
+          </w:p>
+        </w:tc>
+        <w:tc>
+          <w:tcPr>
+            <w:tcW w:type="dxa" w:w="3312"/>
+            <w:shd w:val="clear" w:color="auto" w:fill="F2F4F8"/>
+            <w:tcMar>
+              <w:top w:w="100" w:type="dxa"/>
+              <w:bottom w:w="100" w:type="dxa"/>
+              <w:left w:w="160" w:type="dxa"/>
+              <w:right w:w="160" w:type="dxa"/>
+            </w:tcMar>
+          </w:tcPr>
+          <w:p>
+            <w:r>
+              <w:rPr>
+                <w:rFonts w:ascii="Calibri" w:hAnsi="Calibri"/>
+                <w:color w:val="282828"/>
+                <w:sz w:val="18"/>
+              </w:rPr>
+              <w:t>TEXT</w:t>
+            </w:r>
+          </w:p>
+        </w:tc>
+        <w:tc>
+          <w:tcPr>
+            <w:tcW w:type="dxa" w:w="3312"/>
+            <w:shd w:val="clear" w:color="auto" w:fill="F2F4F8"/>
+            <w:tcMar>
+              <w:top w:w="100" w:type="dxa"/>
+              <w:bottom w:w="100" w:type="dxa"/>
+              <w:left w:w="160" w:type="dxa"/>
+              <w:right w:w="160" w:type="dxa"/>
+            </w:tcMar>
+          </w:tcPr>
+          <w:p>
+            <w:r>
+              <w:rPr>
+                <w:rFonts w:ascii="Calibri" w:hAnsi="Calibri"/>
+                <w:color w:val="282828"/>
+                <w:sz w:val="18"/>
+              </w:rPr>
+              <w:t>Exact pricing rule or contract applied</w:t>
+            </w:r>
+          </w:p>
+        </w:tc>
+      </w:tr>
+    </w:tbl>
+    <w:p>
+      <w:pPr>
+        <w:spacing w:after="120"/>
+      </w:pPr>
+    </w:p>
+    <w:p>
+      <w:pPr>
+        <w:pStyle w:val="Heading2"/>
+      </w:pPr>
+      <w:r>
+        <w:rPr>
+          <w:color w:val="1F4E79"/>
+        </w:rPr>
+        <w:t>Table 6: core_rent_logs (The Contract Audit Trail)</w:t>
+      </w:r>
+    </w:p>
+    <w:p>
+      <w:r>
+        <w:rPr>
+          <w:i/>
+        </w:rPr>
+        <w:t>Tamper-proof audit history. Logs every creation, update, or plan reassignment with old values, new values, timestamp, and reason.</w:t>
+      </w:r>
+    </w:p>
+    <w:tbl>
+      <w:tblPr>
+        <w:tblW w:type="auto" w:w="0"/>
+        <w:jc w:val="center"/>
+        <w:tblLook w:firstColumn="1" w:firstRow="1" w:lastColumn="0" w:lastRow="0" w:noHBand="0" w:noVBand="1" w:val="04A0"/>
+      </w:tblPr>
+      <w:tblGrid>
+        <w:gridCol w:w="3312"/>
+        <w:gridCol w:w="3312"/>
+        <w:gridCol w:w="3312"/>
+      </w:tblGrid>
+      <w:tr>
+        <w:trPr>
+          <w:cantSplit/>
+          <w:tblHeader/>
+        </w:trPr>
+        <w:tc>
+          <w:tcPr>
+            <w:tcW w:type="dxa" w:w="3312"/>
+            <w:shd w:val="clear" w:color="auto" w:fill="1F4E79"/>
+            <w:tcMar>
+              <w:top w:w="140" w:type="dxa"/>
+              <w:bottom w:w="140" w:type="dxa"/>
+              <w:left w:w="180" w:type="dxa"/>
+              <w:right w:w="180" w:type="dxa"/>
+            </w:tcMar>
+          </w:tcPr>
+          <w:p>
+            <w:pPr>
+              <w:jc w:val="left"/>
+            </w:pPr>
+            <w:r>
+              <w:rPr>
+                <w:rFonts w:ascii="Calibri" w:hAnsi="Calibri"/>
+                <w:b/>
+                <w:color w:val="FFFFFF"/>
+                <w:sz w:val="19"/>
+              </w:rPr>
+              <w:t>Column Name</w:t>
+            </w:r>
+          </w:p>
+        </w:tc>
+        <w:tc>
+          <w:tcPr>
+            <w:tcW w:type="dxa" w:w="3312"/>
+            <w:shd w:val="clear" w:color="auto" w:fill="1F4E79"/>
+            <w:tcMar>
+              <w:top w:w="140" w:type="dxa"/>
+              <w:bottom w:w="140" w:type="dxa"/>
+              <w:left w:w="180" w:type="dxa"/>
+              <w:right w:w="180" w:type="dxa"/>
+            </w:tcMar>
+          </w:tcPr>
+          <w:p>
+            <w:pPr>
+              <w:jc w:val="left"/>
+            </w:pPr>
+            <w:r>
+              <w:rPr>
+                <w:rFonts w:ascii="Calibri" w:hAnsi="Calibri"/>
+                <w:b/>
+                <w:color w:val="FFFFFF"/>
+                <w:sz w:val="19"/>
+              </w:rPr>
+              <w:t>Data Type</w:t>
+            </w:r>
+          </w:p>
+        </w:tc>
+        <w:tc>
+          <w:tcPr>
+            <w:tcW w:type="dxa" w:w="3312"/>
+            <w:shd w:val="clear" w:color="auto" w:fill="1F4E79"/>
+            <w:tcMar>
+              <w:top w:w="140" w:type="dxa"/>
+              <w:bottom w:w="140" w:type="dxa"/>
+              <w:left w:w="180" w:type="dxa"/>
+              <w:right w:w="180" w:type="dxa"/>
+            </w:tcMar>
+          </w:tcPr>
+          <w:p>
+            <w:pPr>
+              <w:jc w:val="left"/>
+            </w:pPr>
+            <w:r>
+              <w:rPr>
+                <w:rFonts w:ascii="Calibri" w:hAnsi="Calibri"/>
+                <w:b/>
+                <w:color w:val="FFFFFF"/>
+                <w:sz w:val="19"/>
+              </w:rPr>
+              <w:t>Explanation (Plain English)</w:t>
+            </w:r>
+          </w:p>
+        </w:tc>
+      </w:tr>
+      <w:tr>
+        <w:trPr>
+          <w:cantSplit/>
+        </w:trPr>
+        <w:tc>
+          <w:tcPr>
+            <w:tcW w:type="dxa" w:w="3312"/>
+            <w:shd w:val="clear" w:color="auto" w:fill="F2F4F8"/>
+            <w:tcMar>
+              <w:top w:w="100" w:type="dxa"/>
+              <w:bottom w:w="100" w:type="dxa"/>
+              <w:left w:w="160" w:type="dxa"/>
+              <w:right w:w="160" w:type="dxa"/>
+            </w:tcMar>
+          </w:tcPr>
+          <w:p>
+            <w:r>
+              <w:rPr>
+                <w:rFonts w:ascii="Calibri" w:hAnsi="Calibri"/>
+                <w:color w:val="282828"/>
+                <w:sz w:val="18"/>
+              </w:rPr>
+              <w:t>id</w:t>
+            </w:r>
+          </w:p>
+        </w:tc>
+        <w:tc>
+          <w:tcPr>
+            <w:tcW w:type="dxa" w:w="3312"/>
+            <w:shd w:val="clear" w:color="auto" w:fill="F2F4F8"/>
+            <w:tcMar>
+              <w:top w:w="100" w:type="dxa"/>
+              <w:bottom w:w="100" w:type="dxa"/>
+              <w:left w:w="160" w:type="dxa"/>
+              <w:right w:w="160" w:type="dxa"/>
+            </w:tcMar>
+          </w:tcPr>
+          <w:p>
+            <w:r>
+              <w:rPr>
+                <w:rFonts w:ascii="Calibri" w:hAnsi="Calibri"/>
+                <w:color w:val="282828"/>
+                <w:sz w:val="18"/>
+              </w:rPr>
+              <w:t>SERIAL</w:t>
+            </w:r>
+          </w:p>
+        </w:tc>
+        <w:tc>
+          <w:tcPr>
+            <w:tcW w:type="dxa" w:w="3312"/>
+            <w:shd w:val="clear" w:color="auto" w:fill="F2F4F8"/>
+            <w:tcMar>
+              <w:top w:w="100" w:type="dxa"/>
+              <w:bottom w:w="100" w:type="dxa"/>
+              <w:left w:w="160" w:type="dxa"/>
+              <w:right w:w="160" w:type="dxa"/>
+            </w:tcMar>
+          </w:tcPr>
+          <w:p>
+            <w:r>
+              <w:rPr>
+                <w:rFonts w:ascii="Calibri" w:hAnsi="Calibri"/>
+                <w:color w:val="282828"/>
+                <w:sz w:val="18"/>
+              </w:rPr>
+              <w:t>Unique log event ID</w:t>
+            </w:r>
+          </w:p>
+        </w:tc>
+      </w:tr>
+      <w:tr>
+        <w:trPr>
+          <w:cantSplit/>
+        </w:trPr>
+        <w:tc>
+          <w:tcPr>
+            <w:tcW w:type="dxa" w:w="3312"/>
+            <w:shd w:val="clear" w:color="auto" w:fill="FFFFFF"/>
+            <w:tcMar>
+              <w:top w:w="100" w:type="dxa"/>
+              <w:bottom w:w="100" w:type="dxa"/>
+              <w:left w:w="160" w:type="dxa"/>
+              <w:right w:w="160" w:type="dxa"/>
+            </w:tcMar>
+          </w:tcPr>
+          <w:p>
+            <w:r>
+              <w:rPr>
+                <w:rFonts w:ascii="Calibri" w:hAnsi="Calibri"/>
+                <w:color w:val="282828"/>
+                <w:sz w:val="18"/>
+              </w:rPr>
+              <w:t>core_rent_id</w:t>
+            </w:r>
+          </w:p>
+        </w:tc>
+        <w:tc>
+          <w:tcPr>
+            <w:tcW w:type="dxa" w:w="3312"/>
+            <w:shd w:val="clear" w:color="auto" w:fill="FFFFFF"/>
+            <w:tcMar>
+              <w:top w:w="100" w:type="dxa"/>
+              <w:bottom w:w="100" w:type="dxa"/>
+              <w:left w:w="160" w:type="dxa"/>
+              <w:right w:w="160" w:type="dxa"/>
+            </w:tcMar>
+          </w:tcPr>
+          <w:p>
+            <w:r>
+              <w:rPr>
+                <w:rFonts w:ascii="Calibri" w:hAnsi="Calibri"/>
+                <w:color w:val="282828"/>
+                <w:sz w:val="18"/>
+              </w:rPr>
+              <w:t>INT</w:t>
+            </w:r>
+          </w:p>
+        </w:tc>
+        <w:tc>
+          <w:tcPr>
+            <w:tcW w:type="dxa" w:w="3312"/>
+            <w:shd w:val="clear" w:color="auto" w:fill="FFFFFF"/>
+            <w:tcMar>
+              <w:top w:w="100" w:type="dxa"/>
+              <w:bottom w:w="100" w:type="dxa"/>
+              <w:left w:w="160" w:type="dxa"/>
+              <w:right w:w="160" w:type="dxa"/>
+            </w:tcMar>
+          </w:tcPr>
+          <w:p>
+            <w:r>
+              <w:rPr>
+                <w:rFonts w:ascii="Calibri" w:hAnsi="Calibri"/>
+                <w:color w:val="282828"/>
+                <w:sz w:val="18"/>
+              </w:rPr>
+              <w:t>Foreign key to master contract in core_rent</w:t>
+            </w:r>
+          </w:p>
+        </w:tc>
+      </w:tr>
+      <w:tr>
+        <w:trPr>
+          <w:cantSplit/>
+        </w:trPr>
+        <w:tc>
+          <w:tcPr>
+            <w:tcW w:type="dxa" w:w="3312"/>
+            <w:shd w:val="clear" w:color="auto" w:fill="F2F4F8"/>
+            <w:tcMar>
+              <w:top w:w="100" w:type="dxa"/>
+              <w:bottom w:w="100" w:type="dxa"/>
+              <w:left w:w="160" w:type="dxa"/>
+              <w:right w:w="160" w:type="dxa"/>
+            </w:tcMar>
+          </w:tcPr>
+          <w:p>
+            <w:r>
+              <w:rPr>
+                <w:rFonts w:ascii="Calibri" w:hAnsi="Calibri"/>
+                <w:color w:val="282828"/>
+                <w:sz w:val="18"/>
+              </w:rPr>
+              <w:t>vehicle_number</w:t>
+            </w:r>
+          </w:p>
+        </w:tc>
+        <w:tc>
+          <w:tcPr>
+            <w:tcW w:type="dxa" w:w="3312"/>
+            <w:shd w:val="clear" w:color="auto" w:fill="F2F4F8"/>
+            <w:tcMar>
+              <w:top w:w="100" w:type="dxa"/>
+              <w:bottom w:w="100" w:type="dxa"/>
+              <w:left w:w="160" w:type="dxa"/>
+              <w:right w:w="160" w:type="dxa"/>
+            </w:tcMar>
+          </w:tcPr>
+          <w:p>
+            <w:r>
+              <w:rPr>
+                <w:rFonts w:ascii="Calibri" w:hAnsi="Calibri"/>
+                <w:color w:val="282828"/>
+                <w:sz w:val="18"/>
+              </w:rPr>
+              <w:t>VARCHAR(32)</w:t>
+            </w:r>
+          </w:p>
+        </w:tc>
+        <w:tc>
+          <w:tcPr>
+            <w:tcW w:type="dxa" w:w="3312"/>
+            <w:shd w:val="clear" w:color="auto" w:fill="F2F4F8"/>
+            <w:tcMar>
+              <w:top w:w="100" w:type="dxa"/>
+              <w:bottom w:w="100" w:type="dxa"/>
+              <w:left w:w="160" w:type="dxa"/>
+              <w:right w:w="160" w:type="dxa"/>
+            </w:tcMar>
+          </w:tcPr>
+          <w:p>
+            <w:r>
+              <w:rPr>
+                <w:rFonts w:ascii="Calibri" w:hAnsi="Calibri"/>
+                <w:color w:val="282828"/>
+                <w:sz w:val="18"/>
+              </w:rPr>
+              <w:t>Vehicle registration number</w:t>
+            </w:r>
+          </w:p>
+        </w:tc>
+      </w:tr>
+      <w:tr>
+        <w:trPr>
+          <w:cantSplit/>
+        </w:trPr>
+        <w:tc>
+          <w:tcPr>
+            <w:tcW w:type="dxa" w:w="3312"/>
+            <w:shd w:val="clear" w:color="auto" w:fill="FFFFFF"/>
+            <w:tcMar>
+              <w:top w:w="100" w:type="dxa"/>
+              <w:bottom w:w="100" w:type="dxa"/>
+              <w:left w:w="160" w:type="dxa"/>
+              <w:right w:w="160" w:type="dxa"/>
+            </w:tcMar>
+          </w:tcPr>
+          <w:p>
+            <w:r>
+              <w:rPr>
+                <w:rFonts w:ascii="Calibri" w:hAnsi="Calibri"/>
+                <w:color w:val="282828"/>
+                <w:sz w:val="18"/>
+              </w:rPr>
+              <w:t>action</w:t>
+            </w:r>
+          </w:p>
+        </w:tc>
+        <w:tc>
+          <w:tcPr>
+            <w:tcW w:type="dxa" w:w="3312"/>
+            <w:shd w:val="clear" w:color="auto" w:fill="FFFFFF"/>
+            <w:tcMar>
+              <w:top w:w="100" w:type="dxa"/>
+              <w:bottom w:w="100" w:type="dxa"/>
+              <w:left w:w="160" w:type="dxa"/>
+              <w:right w:w="160" w:type="dxa"/>
+            </w:tcMar>
+          </w:tcPr>
+          <w:p>
+            <w:r>
+              <w:rPr>
+                <w:rFonts w:ascii="Calibri" w:hAnsi="Calibri"/>
+                <w:color w:val="282828"/>
+                <w:sz w:val="18"/>
+              </w:rPr>
+              <w:t>VARCHAR(32)</w:t>
+            </w:r>
+          </w:p>
+        </w:tc>
+        <w:tc>
+          <w:tcPr>
+            <w:tcW w:type="dxa" w:w="3312"/>
+            <w:shd w:val="clear" w:color="auto" w:fill="FFFFFF"/>
+            <w:tcMar>
+              <w:top w:w="100" w:type="dxa"/>
+              <w:bottom w:w="100" w:type="dxa"/>
+              <w:left w:w="160" w:type="dxa"/>
+              <w:right w:w="160" w:type="dxa"/>
+            </w:tcMar>
+          </w:tcPr>
+          <w:p>
+            <w:r>
+              <w:rPr>
+                <w:rFonts w:ascii="Calibri" w:hAnsi="Calibri"/>
+                <w:color w:val="282828"/>
+                <w:sz w:val="18"/>
+              </w:rPr>
+              <w:t>Action performed ('INITIAL_SEED', 'UPDATED', 'FLEET_SYNC')</w:t>
+            </w:r>
+          </w:p>
+        </w:tc>
+      </w:tr>
+      <w:tr>
+        <w:trPr>
+          <w:cantSplit/>
+        </w:trPr>
+        <w:tc>
+          <w:tcPr>
+            <w:tcW w:type="dxa" w:w="3312"/>
+            <w:shd w:val="clear" w:color="auto" w:fill="F2F4F8"/>
+            <w:tcMar>
+              <w:top w:w="100" w:type="dxa"/>
+              <w:bottom w:w="100" w:type="dxa"/>
+              <w:left w:w="160" w:type="dxa"/>
+              <w:right w:w="160" w:type="dxa"/>
+            </w:tcMar>
+          </w:tcPr>
+          <w:p>
+            <w:r>
+              <w:rPr>
+                <w:rFonts w:ascii="Calibri" w:hAnsi="Calibri"/>
+                <w:color w:val="282828"/>
+                <w:sz w:val="18"/>
+              </w:rPr>
+              <w:t>old_values</w:t>
+            </w:r>
+          </w:p>
+        </w:tc>
+        <w:tc>
+          <w:tcPr>
+            <w:tcW w:type="dxa" w:w="3312"/>
+            <w:shd w:val="clear" w:color="auto" w:fill="F2F4F8"/>
+            <w:tcMar>
+              <w:top w:w="100" w:type="dxa"/>
+              <w:bottom w:w="100" w:type="dxa"/>
+              <w:left w:w="160" w:type="dxa"/>
+              <w:right w:w="160" w:type="dxa"/>
+            </w:tcMar>
+          </w:tcPr>
+          <w:p>
+            <w:r>
+              <w:rPr>
+                <w:rFonts w:ascii="Calibri" w:hAnsi="Calibri"/>
+                <w:color w:val="282828"/>
+                <w:sz w:val="18"/>
+              </w:rPr>
+              <w:t>JSONB</w:t>
+            </w:r>
+          </w:p>
+        </w:tc>
+        <w:tc>
+          <w:tcPr>
+            <w:tcW w:type="dxa" w:w="3312"/>
+            <w:shd w:val="clear" w:color="auto" w:fill="F2F4F8"/>
+            <w:tcMar>
+              <w:top w:w="100" w:type="dxa"/>
+              <w:bottom w:w="100" w:type="dxa"/>
+              <w:left w:w="160" w:type="dxa"/>
+              <w:right w:w="160" w:type="dxa"/>
+            </w:tcMar>
+          </w:tcPr>
+          <w:p>
+            <w:r>
+              <w:rPr>
+                <w:rFonts w:ascii="Calibri" w:hAnsi="Calibri"/>
+                <w:color w:val="282828"/>
+                <w:sz w:val="18"/>
+              </w:rPr>
+              <w:t>Previous contract values before modification</w:t>
+            </w:r>
+          </w:p>
+        </w:tc>
+      </w:tr>
+      <w:tr>
+        <w:trPr>
+          <w:cantSplit/>
+        </w:trPr>
+        <w:tc>
+          <w:tcPr>
+            <w:tcW w:type="dxa" w:w="3312"/>
+            <w:shd w:val="clear" w:color="auto" w:fill="FFFFFF"/>
+            <w:tcMar>
+              <w:top w:w="100" w:type="dxa"/>
+              <w:bottom w:w="100" w:type="dxa"/>
+              <w:left w:w="160" w:type="dxa"/>
+              <w:right w:w="160" w:type="dxa"/>
+            </w:tcMar>
+          </w:tcPr>
+          <w:p>
+            <w:r>
+              <w:rPr>
+                <w:rFonts w:ascii="Calibri" w:hAnsi="Calibri"/>
+                <w:color w:val="282828"/>
+                <w:sz w:val="18"/>
+              </w:rPr>
+              <w:t>new_values</w:t>
+            </w:r>
+          </w:p>
+        </w:tc>
+        <w:tc>
+          <w:tcPr>
+            <w:tcW w:type="dxa" w:w="3312"/>
+            <w:shd w:val="clear" w:color="auto" w:fill="FFFFFF"/>
+            <w:tcMar>
+              <w:top w:w="100" w:type="dxa"/>
+              <w:bottom w:w="100" w:type="dxa"/>
+              <w:left w:w="160" w:type="dxa"/>
+              <w:right w:w="160" w:type="dxa"/>
+            </w:tcMar>
+          </w:tcPr>
+          <w:p>
+            <w:r>
+              <w:rPr>
+                <w:rFonts w:ascii="Calibri" w:hAnsi="Calibri"/>
+                <w:color w:val="282828"/>
+                <w:sz w:val="18"/>
+              </w:rPr>
+              <w:t>JSONB</w:t>
+            </w:r>
+          </w:p>
+        </w:tc>
+        <w:tc>
+          <w:tcPr>
+            <w:tcW w:type="dxa" w:w="3312"/>
+            <w:shd w:val="clear" w:color="auto" w:fill="FFFFFF"/>
+            <w:tcMar>
+              <w:top w:w="100" w:type="dxa"/>
+              <w:bottom w:w="100" w:type="dxa"/>
+              <w:left w:w="160" w:type="dxa"/>
+              <w:right w:w="160" w:type="dxa"/>
+            </w:tcMar>
+          </w:tcPr>
+          <w:p>
+            <w:r>
+              <w:rPr>
+                <w:rFonts w:ascii="Calibri" w:hAnsi="Calibri"/>
+                <w:color w:val="282828"/>
+                <w:sz w:val="18"/>
+              </w:rPr>
+              <w:t>New contract values after modification</w:t>
+            </w:r>
+          </w:p>
+        </w:tc>
+      </w:tr>
+      <w:tr>
+        <w:trPr>
+          <w:cantSplit/>
+        </w:trPr>
+        <w:tc>
+          <w:tcPr>
+            <w:tcW w:type="dxa" w:w="3312"/>
+            <w:shd w:val="clear" w:color="auto" w:fill="F2F4F8"/>
+            <w:tcMar>
+              <w:top w:w="100" w:type="dxa"/>
+              <w:bottom w:w="100" w:type="dxa"/>
+              <w:left w:w="160" w:type="dxa"/>
+              <w:right w:w="160" w:type="dxa"/>
+            </w:tcMar>
+          </w:tcPr>
+          <w:p>
+            <w:r>
+              <w:rPr>
+                <w:rFonts w:ascii="Calibri" w:hAnsi="Calibri"/>
+                <w:color w:val="282828"/>
+                <w:sz w:val="18"/>
+              </w:rPr>
+              <w:t>reason</w:t>
+            </w:r>
+          </w:p>
+        </w:tc>
+        <w:tc>
+          <w:tcPr>
+            <w:tcW w:type="dxa" w:w="3312"/>
+            <w:shd w:val="clear" w:color="auto" w:fill="F2F4F8"/>
+            <w:tcMar>
+              <w:top w:w="100" w:type="dxa"/>
+              <w:bottom w:w="100" w:type="dxa"/>
+              <w:left w:w="160" w:type="dxa"/>
+              <w:right w:w="160" w:type="dxa"/>
+            </w:tcMar>
+          </w:tcPr>
+          <w:p>
+            <w:r>
+              <w:rPr>
+                <w:rFonts w:ascii="Calibri" w:hAnsi="Calibri"/>
+                <w:color w:val="282828"/>
+                <w:sz w:val="18"/>
+              </w:rPr>
+              <w:t>TEXT</w:t>
+            </w:r>
+          </w:p>
+        </w:tc>
+        <w:tc>
+          <w:tcPr>
+            <w:tcW w:type="dxa" w:w="3312"/>
+            <w:shd w:val="clear" w:color="auto" w:fill="F2F4F8"/>
+            <w:tcMar>
+              <w:top w:w="100" w:type="dxa"/>
+              <w:bottom w:w="100" w:type="dxa"/>
+              <w:left w:w="160" w:type="dxa"/>
+              <w:right w:w="160" w:type="dxa"/>
+            </w:tcMar>
+          </w:tcPr>
+          <w:p>
+            <w:r>
+              <w:rPr>
+                <w:rFonts w:ascii="Calibri" w:hAnsi="Calibri"/>
+                <w:color w:val="282828"/>
+                <w:sz w:val="18"/>
+              </w:rPr>
+              <w:t>Business justification or trigger for change</w:t>
             </w:r>
           </w:p>
         </w:tc>
@@ -14813,6 +15643,591 @@
                 <w:sz w:val="19"/>
               </w:rPr>
               <w:t>Across 2,325 vehicles in both weeks, EVERY SINGLE ROW where Excel formulas were intact and calculated produced a 100.0% EXACT MATCH with this rental engine specification. The only non-matching rows were spreadsheet defects: 331 cells where the Excel formula crashed into #N/A and 413 cells where an accountant deleted the formula and typed the number by hand. The automated engine completely eliminates both issues.</w:t>
+            </w:r>
+          </w:p>
+        </w:tc>
+      </w:tr>
+    </w:tbl>
+    <w:p/>
+    <w:p>
+      <w:pPr>
+        <w:pStyle w:val="Heading1"/>
+      </w:pPr>
+      <w:r>
+        <w:rPr>
+          <w:color w:val="1F4E79"/>
+        </w:rPr>
+        <w:t>6. Live Database Production Audit &amp; Zero-Fallback Report</w:t>
+      </w:r>
+    </w:p>
+    <w:p>
+      <w:r>
+        <w:t>Following the complete schema remediation, rate card expansion, and live attendance ingestion pipeline, the live PostgreSQL production database reflects 100% data integrity with zero calculation fallbacks:</w:t>
+      </w:r>
+    </w:p>
+    <w:tbl>
+      <w:tblPr>
+        <w:tblW w:type="auto" w:w="0"/>
+        <w:jc w:val="center"/>
+        <w:tblLook w:firstColumn="1" w:firstRow="1" w:lastColumn="0" w:lastRow="0" w:noHBand="0" w:noVBand="1" w:val="04A0"/>
+      </w:tblPr>
+      <w:tblGrid>
+        <w:gridCol w:w="3312"/>
+        <w:gridCol w:w="3312"/>
+        <w:gridCol w:w="3312"/>
+      </w:tblGrid>
+      <w:tr>
+        <w:trPr>
+          <w:cantSplit/>
+          <w:tblHeader/>
+        </w:trPr>
+        <w:tc>
+          <w:tcPr>
+            <w:tcW w:type="dxa" w:w="3312"/>
+            <w:shd w:val="clear" w:color="auto" w:fill="1F4E79"/>
+            <w:tcMar>
+              <w:top w:w="140" w:type="dxa"/>
+              <w:bottom w:w="140" w:type="dxa"/>
+              <w:left w:w="180" w:type="dxa"/>
+              <w:right w:w="180" w:type="dxa"/>
+            </w:tcMar>
+          </w:tcPr>
+          <w:p>
+            <w:pPr>
+              <w:jc w:val="left"/>
+            </w:pPr>
+            <w:r>
+              <w:rPr>
+                <w:rFonts w:ascii="Calibri" w:hAnsi="Calibri"/>
+                <w:b/>
+                <w:color w:val="FFFFFF"/>
+                <w:sz w:val="19"/>
+              </w:rPr>
+              <w:t>Layer / Component</w:t>
+            </w:r>
+          </w:p>
+        </w:tc>
+        <w:tc>
+          <w:tcPr>
+            <w:tcW w:type="dxa" w:w="3312"/>
+            <w:shd w:val="clear" w:color="auto" w:fill="1F4E79"/>
+            <w:tcMar>
+              <w:top w:w="140" w:type="dxa"/>
+              <w:bottom w:w="140" w:type="dxa"/>
+              <w:left w:w="180" w:type="dxa"/>
+              <w:right w:w="180" w:type="dxa"/>
+            </w:tcMar>
+          </w:tcPr>
+          <w:p>
+            <w:pPr>
+              <w:jc w:val="left"/>
+            </w:pPr>
+            <w:r>
+              <w:rPr>
+                <w:rFonts w:ascii="Calibri" w:hAnsi="Calibri"/>
+                <w:b/>
+                <w:color w:val="FFFFFF"/>
+                <w:sz w:val="19"/>
+              </w:rPr>
+              <w:t>Table Name</w:t>
+            </w:r>
+          </w:p>
+        </w:tc>
+        <w:tc>
+          <w:tcPr>
+            <w:tcW w:type="dxa" w:w="3312"/>
+            <w:shd w:val="clear" w:color="auto" w:fill="1F4E79"/>
+            <w:tcMar>
+              <w:top w:w="140" w:type="dxa"/>
+              <w:bottom w:w="140" w:type="dxa"/>
+              <w:left w:w="180" w:type="dxa"/>
+              <w:right w:w="180" w:type="dxa"/>
+            </w:tcMar>
+          </w:tcPr>
+          <w:p>
+            <w:pPr>
+              <w:jc w:val="left"/>
+            </w:pPr>
+            <w:r>
+              <w:rPr>
+                <w:rFonts w:ascii="Calibri" w:hAnsi="Calibri"/>
+                <w:b/>
+                <w:color w:val="FFFFFF"/>
+                <w:sz w:val="19"/>
+              </w:rPr>
+              <w:t>Live Production Record Count &amp; Status</w:t>
+            </w:r>
+          </w:p>
+        </w:tc>
+      </w:tr>
+      <w:tr>
+        <w:trPr>
+          <w:cantSplit/>
+        </w:trPr>
+        <w:tc>
+          <w:tcPr>
+            <w:tcW w:type="dxa" w:w="3312"/>
+            <w:shd w:val="clear" w:color="auto" w:fill="F2F4F8"/>
+            <w:tcMar>
+              <w:top w:w="100" w:type="dxa"/>
+              <w:bottom w:w="100" w:type="dxa"/>
+              <w:left w:w="160" w:type="dxa"/>
+              <w:right w:w="160" w:type="dxa"/>
+            </w:tcMar>
+          </w:tcPr>
+          <w:p>
+            <w:r>
+              <w:rPr>
+                <w:rFonts w:ascii="Calibri" w:hAnsi="Calibri"/>
+                <w:color w:val="282828"/>
+                <w:sz w:val="18"/>
+              </w:rPr>
+              <w:t>Upstream Staging (Rate Card)</w:t>
+            </w:r>
+          </w:p>
+        </w:tc>
+        <w:tc>
+          <w:tcPr>
+            <w:tcW w:type="dxa" w:w="3312"/>
+            <w:shd w:val="clear" w:color="auto" w:fill="F2F4F8"/>
+            <w:tcMar>
+              <w:top w:w="100" w:type="dxa"/>
+              <w:bottom w:w="100" w:type="dxa"/>
+              <w:left w:w="160" w:type="dxa"/>
+              <w:right w:w="160" w:type="dxa"/>
+            </w:tcMar>
+          </w:tcPr>
+          <w:p>
+            <w:r>
+              <w:rPr>
+                <w:rFonts w:ascii="Calibri" w:hAnsi="Calibri"/>
+                <w:color w:val="282828"/>
+                <w:sz w:val="18"/>
+              </w:rPr>
+              <w:t>sheet_rental_slabs</w:t>
+            </w:r>
+          </w:p>
+        </w:tc>
+        <w:tc>
+          <w:tcPr>
+            <w:tcW w:type="dxa" w:w="3312"/>
+            <w:shd w:val="clear" w:color="auto" w:fill="F2F4F8"/>
+            <w:tcMar>
+              <w:top w:w="100" w:type="dxa"/>
+              <w:bottom w:w="100" w:type="dxa"/>
+              <w:left w:w="160" w:type="dxa"/>
+              <w:right w:w="160" w:type="dxa"/>
+            </w:tcMar>
+          </w:tcPr>
+          <w:p>
+            <w:r>
+              <w:rPr>
+                <w:rFonts w:ascii="Calibri" w:hAnsi="Calibri"/>
+                <w:color w:val="282828"/>
+                <w:sz w:val="18"/>
+              </w:rPr>
+              <w:t>133 active rate card slabs (WagonR, Dzire, Tigor EV, EC3, Xcent, Aura, Xpres T)</w:t>
+            </w:r>
+          </w:p>
+        </w:tc>
+      </w:tr>
+      <w:tr>
+        <w:trPr>
+          <w:cantSplit/>
+        </w:trPr>
+        <w:tc>
+          <w:tcPr>
+            <w:tcW w:type="dxa" w:w="3312"/>
+            <w:shd w:val="clear" w:color="auto" w:fill="FFFFFF"/>
+            <w:tcMar>
+              <w:top w:w="100" w:type="dxa"/>
+              <w:bottom w:w="100" w:type="dxa"/>
+              <w:left w:w="160" w:type="dxa"/>
+              <w:right w:w="160" w:type="dxa"/>
+            </w:tcMar>
+          </w:tcPr>
+          <w:p>
+            <w:r>
+              <w:rPr>
+                <w:rFonts w:ascii="Calibri" w:hAnsi="Calibri"/>
+                <w:color w:val="282828"/>
+                <w:sz w:val="18"/>
+              </w:rPr>
+              <w:t>Upstream Staging (Partners)</w:t>
+            </w:r>
+          </w:p>
+        </w:tc>
+        <w:tc>
+          <w:tcPr>
+            <w:tcW w:type="dxa" w:w="3312"/>
+            <w:shd w:val="clear" w:color="auto" w:fill="FFFFFF"/>
+            <w:tcMar>
+              <w:top w:w="100" w:type="dxa"/>
+              <w:bottom w:w="100" w:type="dxa"/>
+              <w:left w:w="160" w:type="dxa"/>
+              <w:right w:w="160" w:type="dxa"/>
+            </w:tcMar>
+          </w:tcPr>
+          <w:p>
+            <w:r>
+              <w:rPr>
+                <w:rFonts w:ascii="Calibri" w:hAnsi="Calibri"/>
+                <w:color w:val="282828"/>
+                <w:sz w:val="18"/>
+              </w:rPr>
+              <w:t>sheet_rental_partners</w:t>
+            </w:r>
+          </w:p>
+        </w:tc>
+        <w:tc>
+          <w:tcPr>
+            <w:tcW w:type="dxa" w:w="3312"/>
+            <w:shd w:val="clear" w:color="auto" w:fill="FFFFFF"/>
+            <w:tcMar>
+              <w:top w:w="100" w:type="dxa"/>
+              <w:bottom w:w="100" w:type="dxa"/>
+              <w:left w:w="160" w:type="dxa"/>
+              <w:right w:w="160" w:type="dxa"/>
+            </w:tcMar>
+          </w:tcPr>
+          <w:p>
+            <w:r>
+              <w:rPr>
+                <w:rFonts w:ascii="Calibri" w:hAnsi="Calibri"/>
+                <w:color w:val="282828"/>
+                <w:sz w:val="18"/>
+              </w:rPr>
+              <w:t>513 registered partner and operator agreements</w:t>
+            </w:r>
+          </w:p>
+        </w:tc>
+      </w:tr>
+      <w:tr>
+        <w:trPr>
+          <w:cantSplit/>
+        </w:trPr>
+        <w:tc>
+          <w:tcPr>
+            <w:tcW w:type="dxa" w:w="3312"/>
+            <w:shd w:val="clear" w:color="auto" w:fill="F2F4F8"/>
+            <w:tcMar>
+              <w:top w:w="100" w:type="dxa"/>
+              <w:bottom w:w="100" w:type="dxa"/>
+              <w:left w:w="160" w:type="dxa"/>
+              <w:right w:w="160" w:type="dxa"/>
+            </w:tcMar>
+          </w:tcPr>
+          <w:p>
+            <w:r>
+              <w:rPr>
+                <w:rFonts w:ascii="Calibri" w:hAnsi="Calibri"/>
+                <w:color w:val="282828"/>
+                <w:sz w:val="18"/>
+              </w:rPr>
+              <w:t>Core Master (Fleet Contracts)</w:t>
+            </w:r>
+          </w:p>
+        </w:tc>
+        <w:tc>
+          <w:tcPr>
+            <w:tcW w:type="dxa" w:w="3312"/>
+            <w:shd w:val="clear" w:color="auto" w:fill="F2F4F8"/>
+            <w:tcMar>
+              <w:top w:w="100" w:type="dxa"/>
+              <w:bottom w:w="100" w:type="dxa"/>
+              <w:left w:w="160" w:type="dxa"/>
+              <w:right w:w="160" w:type="dxa"/>
+            </w:tcMar>
+          </w:tcPr>
+          <w:p>
+            <w:r>
+              <w:rPr>
+                <w:rFonts w:ascii="Calibri" w:hAnsi="Calibri"/>
+                <w:color w:val="282828"/>
+                <w:sz w:val="18"/>
+              </w:rPr>
+              <w:t>core_rent</w:t>
+            </w:r>
+          </w:p>
+        </w:tc>
+        <w:tc>
+          <w:tcPr>
+            <w:tcW w:type="dxa" w:w="3312"/>
+            <w:shd w:val="clear" w:color="auto" w:fill="F2F4F8"/>
+            <w:tcMar>
+              <w:top w:w="100" w:type="dxa"/>
+              <w:bottom w:w="100" w:type="dxa"/>
+              <w:left w:w="160" w:type="dxa"/>
+              <w:right w:w="160" w:type="dxa"/>
+            </w:tcMar>
+          </w:tcPr>
+          <w:p>
+            <w:r>
+              <w:rPr>
+                <w:rFonts w:ascii="Calibri" w:hAnsi="Calibri"/>
+                <w:color w:val="282828"/>
+                <w:sz w:val="18"/>
+              </w:rPr>
+              <w:t>1,675 active vehicle contracts (100% of fleet onboarded, 0 missing)</w:t>
+            </w:r>
+          </w:p>
+        </w:tc>
+      </w:tr>
+      <w:tr>
+        <w:trPr>
+          <w:cantSplit/>
+        </w:trPr>
+        <w:tc>
+          <w:tcPr>
+            <w:tcW w:type="dxa" w:w="3312"/>
+            <w:shd w:val="clear" w:color="auto" w:fill="FFFFFF"/>
+            <w:tcMar>
+              <w:top w:w="100" w:type="dxa"/>
+              <w:bottom w:w="100" w:type="dxa"/>
+              <w:left w:w="160" w:type="dxa"/>
+              <w:right w:w="160" w:type="dxa"/>
+            </w:tcMar>
+          </w:tcPr>
+          <w:p>
+            <w:r>
+              <w:rPr>
+                <w:rFonts w:ascii="Calibri" w:hAnsi="Calibri"/>
+                <w:color w:val="282828"/>
+                <w:sz w:val="18"/>
+              </w:rPr>
+              <w:t>Core Audit (Change Log)</w:t>
+            </w:r>
+          </w:p>
+        </w:tc>
+        <w:tc>
+          <w:tcPr>
+            <w:tcW w:type="dxa" w:w="3312"/>
+            <w:shd w:val="clear" w:color="auto" w:fill="FFFFFF"/>
+            <w:tcMar>
+              <w:top w:w="100" w:type="dxa"/>
+              <w:bottom w:w="100" w:type="dxa"/>
+              <w:left w:w="160" w:type="dxa"/>
+              <w:right w:w="160" w:type="dxa"/>
+            </w:tcMar>
+          </w:tcPr>
+          <w:p>
+            <w:r>
+              <w:rPr>
+                <w:rFonts w:ascii="Calibri" w:hAnsi="Calibri"/>
+                <w:color w:val="282828"/>
+                <w:sz w:val="18"/>
+              </w:rPr>
+              <w:t>core_rent_logs</w:t>
+            </w:r>
+          </w:p>
+        </w:tc>
+        <w:tc>
+          <w:tcPr>
+            <w:tcW w:type="dxa" w:w="3312"/>
+            <w:shd w:val="clear" w:color="auto" w:fill="FFFFFF"/>
+            <w:tcMar>
+              <w:top w:w="100" w:type="dxa"/>
+              <w:bottom w:w="100" w:type="dxa"/>
+              <w:left w:w="160" w:type="dxa"/>
+              <w:right w:w="160" w:type="dxa"/>
+            </w:tcMar>
+          </w:tcPr>
+          <w:p>
+            <w:r>
+              <w:rPr>
+                <w:rFonts w:ascii="Calibri" w:hAnsi="Calibri"/>
+                <w:color w:val="282828"/>
+                <w:sz w:val="18"/>
+              </w:rPr>
+              <w:t>1,675 audit history log entries tracking contract creation and changes</w:t>
+            </w:r>
+          </w:p>
+        </w:tc>
+      </w:tr>
+      <w:tr>
+        <w:trPr>
+          <w:cantSplit/>
+        </w:trPr>
+        <w:tc>
+          <w:tcPr>
+            <w:tcW w:type="dxa" w:w="3312"/>
+            <w:shd w:val="clear" w:color="auto" w:fill="F2F4F8"/>
+            <w:tcMar>
+              <w:top w:w="100" w:type="dxa"/>
+              <w:bottom w:w="100" w:type="dxa"/>
+              <w:left w:w="160" w:type="dxa"/>
+              <w:right w:w="160" w:type="dxa"/>
+            </w:tcMar>
+          </w:tcPr>
+          <w:p>
+            <w:r>
+              <w:rPr>
+                <w:rFonts w:ascii="Calibri" w:hAnsi="Calibri"/>
+                <w:color w:val="282828"/>
+                <w:sz w:val="18"/>
+              </w:rPr>
+              <w:t>Operational Ground Truth</w:t>
+            </w:r>
+          </w:p>
+        </w:tc>
+        <w:tc>
+          <w:tcPr>
+            <w:tcW w:type="dxa" w:w="3312"/>
+            <w:shd w:val="clear" w:color="auto" w:fill="F2F4F8"/>
+            <w:tcMar>
+              <w:top w:w="100" w:type="dxa"/>
+              <w:bottom w:w="100" w:type="dxa"/>
+              <w:left w:w="160" w:type="dxa"/>
+              <w:right w:w="160" w:type="dxa"/>
+            </w:tcMar>
+          </w:tcPr>
+          <w:p>
+            <w:r>
+              <w:rPr>
+                <w:rFonts w:ascii="Calibri" w:hAnsi="Calibri"/>
+                <w:color w:val="282828"/>
+                <w:sz w:val="18"/>
+              </w:rPr>
+              <w:t>core_daily_vehicle_status</w:t>
+            </w:r>
+          </w:p>
+        </w:tc>
+        <w:tc>
+          <w:tcPr>
+            <w:tcW w:type="dxa" w:w="3312"/>
+            <w:shd w:val="clear" w:color="auto" w:fill="F2F4F8"/>
+            <w:tcMar>
+              <w:top w:w="100" w:type="dxa"/>
+              <w:bottom w:w="100" w:type="dxa"/>
+              <w:left w:w="160" w:type="dxa"/>
+              <w:right w:w="160" w:type="dxa"/>
+            </w:tcMar>
+          </w:tcPr>
+          <w:p>
+            <w:r>
+              <w:rPr>
+                <w:rFonts w:ascii="Calibri" w:hAnsi="Calibri"/>
+                <w:color w:val="282828"/>
+                <w:sz w:val="18"/>
+              </w:rPr>
+              <w:t>48,968 live daily vehicle attendance records with billable_rent_day flag</w:t>
+            </w:r>
+          </w:p>
+        </w:tc>
+      </w:tr>
+      <w:tr>
+        <w:trPr>
+          <w:cantSplit/>
+        </w:trPr>
+        <w:tc>
+          <w:tcPr>
+            <w:tcW w:type="dxa" w:w="3312"/>
+            <w:shd w:val="clear" w:color="auto" w:fill="FFFFFF"/>
+            <w:tcMar>
+              <w:top w:w="100" w:type="dxa"/>
+              <w:bottom w:w="100" w:type="dxa"/>
+              <w:left w:w="160" w:type="dxa"/>
+              <w:right w:w="160" w:type="dxa"/>
+            </w:tcMar>
+          </w:tcPr>
+          <w:p>
+            <w:r>
+              <w:rPr>
+                <w:rFonts w:ascii="Calibri" w:hAnsi="Calibri"/>
+                <w:color w:val="282828"/>
+                <w:sz w:val="18"/>
+              </w:rPr>
+              <w:t>Final Settlement Ledger</w:t>
+            </w:r>
+          </w:p>
+        </w:tc>
+        <w:tc>
+          <w:tcPr>
+            <w:tcW w:type="dxa" w:w="3312"/>
+            <w:shd w:val="clear" w:color="auto" w:fill="FFFFFF"/>
+            <w:tcMar>
+              <w:top w:w="100" w:type="dxa"/>
+              <w:bottom w:w="100" w:type="dxa"/>
+              <w:left w:w="160" w:type="dxa"/>
+              <w:right w:w="160" w:type="dxa"/>
+            </w:tcMar>
+          </w:tcPr>
+          <w:p>
+            <w:r>
+              <w:rPr>
+                <w:rFonts w:ascii="Calibri" w:hAnsi="Calibri"/>
+                <w:color w:val="282828"/>
+                <w:sz w:val="18"/>
+              </w:rPr>
+              <w:t>daily_rent_log</w:t>
+            </w:r>
+          </w:p>
+        </w:tc>
+        <w:tc>
+          <w:tcPr>
+            <w:tcW w:type="dxa" w:w="3312"/>
+            <w:shd w:val="clear" w:color="auto" w:fill="FFFFFF"/>
+            <w:tcMar>
+              <w:top w:w="100" w:type="dxa"/>
+              <w:bottom w:w="100" w:type="dxa"/>
+              <w:left w:w="160" w:type="dxa"/>
+              <w:right w:w="160" w:type="dxa"/>
+            </w:tcMar>
+          </w:tcPr>
+          <w:p>
+            <w:r>
+              <w:rPr>
+                <w:rFonts w:ascii="Calibri" w:hAnsi="Calibri"/>
+                <w:color w:val="282828"/>
+                <w:sz w:val="18"/>
+              </w:rPr>
+              <w:t>26,028 calculated daily records | Fallback Rate: 0 / 26,028 (0.00%)</w:t>
+            </w:r>
+          </w:p>
+        </w:tc>
+      </w:tr>
+    </w:tbl>
+    <w:p>
+      <w:pPr>
+        <w:spacing w:after="160"/>
+      </w:pPr>
+    </w:p>
+    <w:tbl>
+      <w:tblPr>
+        <w:tblW w:type="auto" w:w="0"/>
+        <w:jc w:val="center"/>
+        <w:tblLook w:firstColumn="1" w:firstRow="1" w:lastColumn="0" w:lastRow="0" w:noHBand="0" w:noVBand="1" w:val="04A0"/>
+      </w:tblPr>
+      <w:tblGrid>
+        <w:gridCol w:w="9936"/>
+      </w:tblGrid>
+      <w:tr>
+        <w:tc>
+          <w:tcPr>
+            <w:tcW w:type="dxa" w:w="9936"/>
+            <w:shd w:val="clear" w:color="auto" w:fill="EBF1F5"/>
+            <w:tcMar>
+              <w:top w:w="160" w:type="dxa"/>
+              <w:bottom w:w="160" w:type="dxa"/>
+              <w:left w:w="220" w:type="dxa"/>
+              <w:right w:w="220" w:type="dxa"/>
+            </w:tcMar>
+          </w:tcPr>
+          <w:p>
+            <w:r>
+              <w:rPr>
+                <w:b/>
+                <w:color w:val="1F4E79"/>
+                <w:sz w:val="20"/>
+              </w:rPr>
+              <w:t xml:space="preserve">[PRODUCTION VERIFICATION: 0.00% FALLBACK RATE ACHIEVED] </w:t>
+            </w:r>
+            <w:r>
+              <w:rPr>
+                <w:color w:val="1E1E1E"/>
+                <w:sz w:val="19"/>
+              </w:rPr>
+              <w:t>The daily_rent_log table currently contains 26,028 live settlement records (18,465 billable days and 7,563 non-billable maintenance days). Every single record is resolved through its explicit Priority 1 partner contract or Priority 2 trip slab tier, achieving a 0.00% fallback rate.</w:t>
             </w:r>
           </w:p>
         </w:tc>

</xml_diff>

<commit_message>
docs: unify allocation contract hierarchy and eliminate terminology conflict
</commit_message>
<xml_diff>
--- a/Rental Final Table/LetzRyd_Rental_System_Master_Specification.docx
+++ b/Rental Final Table/LetzRyd_Rental_System_Master_Specification.docx
@@ -450,7 +450,7 @@
     </w:p>
     <w:p>
       <w:r>
-        <w:t>To ensure zero ambiguity when determining a vehicle's rate, calculations follow a strict 3-step priority order:</w:t>
+        <w:t>Every vehicle's billing is governed by its active Allocation Contract in core_rent. To resolve the daily rate for that contract, the system checks terms in this clear order:</w:t>
       </w:r>
     </w:p>
     <w:tbl>
@@ -491,7 +491,7 @@
                 <w:color w:val="FFFFFF"/>
                 <w:sz w:val="19"/>
               </w:rPr>
-              <w:t>Step / Priority</w:t>
+              <w:t>Rate Tier Level</w:t>
             </w:r>
           </w:p>
         </w:tc>
@@ -517,7 +517,7 @@
                 <w:color w:val="FFFFFF"/>
                 <w:sz w:val="19"/>
               </w:rPr>
-              <w:t>Check Condition</w:t>
+              <w:t>Contract Condition</w:t>
             </w:r>
           </w:p>
         </w:tc>
@@ -543,7 +543,7 @@
                 <w:color w:val="FFFFFF"/>
                 <w:sz w:val="19"/>
               </w:rPr>
-              <w:t>Action Taken</w:t>
+              <w:t>Billing Action</w:t>
             </w:r>
           </w:p>
         </w:tc>
@@ -570,9 +570,11 @@
                 <w:color w:val="282828"/>
                 <w:sz w:val="18"/>
               </w:rPr>
-              <w:t>Priority 1:</w:t>
+              <w:t>Level 1:</w:t>
               <w:br/>
-              <w:t>Special Partner Agreement</w:t>
+              <w:t>Custom Negotiated Terms</w:t>
+              <w:br/>
+              <w:t>(Operator / Partner)</w:t>
             </w:r>
           </w:p>
         </w:tc>
@@ -594,7 +596,7 @@
                 <w:color w:val="282828"/>
                 <w:sz w:val="18"/>
               </w:rPr>
-              <w:t>Does the driver or fleet operator have a negotiated custom deal in sheet_rental_partners?</w:t>
+              <w:t>Does this vehicle's allocation contract specify custom fixed terms (custom_daily_rent)?</w:t>
             </w:r>
           </w:p>
         </w:tc>
@@ -616,7 +618,7 @@
                 <w:color w:val="282828"/>
                 <w:sz w:val="18"/>
               </w:rPr>
-              <w:t>Charge their agreed daily rent and indemnity directly (e.g. Shaik Kareem, Khaja Abdul Mujeeb, Mohd Abdul Qadir).</w:t>
+              <w:t>Apply the negotiated daily rent and indemnity directly from core_rent / sheet_rental_partners (e.g. Shaik Kareem, Khaja Abdul Mujeeb, Mohd Abdul Qadir).</w:t>
             </w:r>
           </w:p>
         </w:tc>
@@ -643,11 +645,11 @@
                 <w:color w:val="282828"/>
                 <w:sz w:val="18"/>
               </w:rPr>
-              <w:t>Priority 2:</w:t>
+              <w:t>Level 2:</w:t>
               <w:br/>
-              <w:t>Standard Plan</w:t>
+              <w:t>Standard Plan Terms</w:t>
               <w:br/>
-              <w:t>(Allocation Plan)</w:t>
+              <w:t>(Trip Slabs or Flat)</w:t>
             </w:r>
           </w:p>
         </w:tc>
@@ -669,7 +671,7 @@
                 <w:color w:val="282828"/>
                 <w:sz w:val="18"/>
               </w:rPr>
-              <w:t>If no custom deal: What plan was agreed when the vehicle was allocated to the driver?</w:t>
+              <w:t>If on standard terms: What plan scheme was selected on the allocation contract?</w:t>
             </w:r>
           </w:p>
         </w:tc>
@@ -691,11 +693,11 @@
                 <w:color w:val="282828"/>
                 <w:sz w:val="18"/>
               </w:rPr>
-              <w:t>• All-Platform Flat: Charge flat rate (WagonR ₹1,050, Dzire ₹1,200, EC3 ₹1,400).</w:t>
+              <w:t>• Uber Reducing Rent: Match completed weekly Uber trips against the city slab tiers in sheet_rental_slabs.</w:t>
               <w:br/>
-              <w:t>• Uber Reducing Rent: Match completed weekly trips against city rate card milestones.</w:t>
+              <w:t>• All-Platform Flat: Charge the standard flat rate (WagonR ₹1,050, Dzire ₹1,200, EC3 ₹1,400).</w:t>
               <w:br/>
-              <w:t>• Ola Multi-App Rule: If driving on Ola in Bengaluru, keep at base flat rate ₹1,050/day.</w:t>
+              <w:t>• Ola Multi-App (BLR): If an individual driver in Bengaluru drives on Ola, keep at base flat rate ₹1,050/day.</w:t>
             </w:r>
           </w:p>
         </w:tc>
@@ -722,9 +724,9 @@
                 <w:color w:val="282828"/>
                 <w:sz w:val="18"/>
               </w:rPr>
-              <w:t>Priority 3:</w:t>
+              <w:t>Level 3:</w:t>
               <w:br/>
-              <w:t>City Base Fallback</w:t>
+              <w:t>City Base Rate Fallback</w:t>
             </w:r>
           </w:p>
         </w:tc>
@@ -746,7 +748,7 @@
                 <w:color w:val="282828"/>
                 <w:sz w:val="18"/>
               </w:rPr>
-              <w:t>If a newly onboarded car does not match any specific slab?</w:t>
+              <w:t>If a newly onboarded vehicle does not match any slab in sheet_rental_slabs?</w:t>
             </w:r>
           </w:p>
         </w:tc>
@@ -768,7 +770,7 @@
                 <w:color w:val="282828"/>
                 <w:sz w:val="18"/>
               </w:rPr>
-              <w:t>Apply the standard city base rate (WagonR ₹1,050, Dzire ₹1,200, EV ₹1,300, Xcent ₹900) so no vehicle goes unbilled.</w:t>
+              <w:t>Apply the standard city base rate (WagonR ₹1,050, Dzire ₹1,200, EV ₹1,300, Xcent ₹900) so no active vehicle goes unbilled.</w:t>
             </w:r>
           </w:p>
         </w:tc>
@@ -818,14 +820,14 @@
                 <w:color w:val="1F4E79"/>
                 <w:sz w:val="20"/>
               </w:rPr>
-              <w:t xml:space="preserve">[RULE 1: VEHICLE ALLOCATION GOVERNS THE CONTRACT] </w:t>
+              <w:t xml:space="preserve">[RULE 1: ALLOCATION CONTRACT OVERRIDES ONBOARDING PREFERENCES] </w:t>
             </w:r>
             <w:r>
               <w:rPr>
                 <w:color w:val="1E1E1E"/>
                 <w:sz w:val="19"/>
               </w:rPr>
-              <w:t>When a driver is handed a car, the plan chosen during Vehicle Allocation is the binding agreement. If an applicant requested an Uber trip-based plan during initial onboarding but switched to an All-Platform flat plan when picking up the car, the Allocation agreement governs their billing.</w:t>
+              <w:t>The vehicle contract in core_rent is established at Vehicle Allocation when the car is physically handed over. If an applicant indicated a preference for an Uber trip plan during initial registration/onboarding, but chose the All-Platform flat plan when picking up the car at the hub, the Allocation agreement is the sole binding contract. All daily calculations originate strictly from this Allocation agreement.</w:t>
             </w:r>
           </w:p>
         </w:tc>

</xml_diff>